<commit_message>
added text and changes
</commit_message>
<xml_diff>
--- a/project1.docx
+++ b/project1.docx
@@ -65,6 +65,18 @@
         </w:rPr>
         <w:t xml:space="preserve"> accuracy on the test data, and we will compare our models with this value. </w:t>
       </w:r>
+      <w:r>
+        <w:rPr>
+          <w:lang w:val="is-IS"/>
+        </w:rPr>
+        <w:t xml:space="preserve">In this project, we didn‘t find a model which improved the accuracy a lot. So we decided to try a lot of different models, rather then squeezing extra </w:t>
+      </w:r>
+      <w:r>
+        <w:rPr>
+          <w:lang w:val="is-IS"/>
+        </w:rPr>
+        <w:t xml:space="preserve">0.1-0.2 percentage points to existing ones. </w:t>
+      </w:r>
     </w:p>
     <w:p>
       <w:pPr>
@@ -187,7 +199,19 @@
         <w:rPr>
           <w:lang w:val="is-IS"/>
         </w:rPr>
-        <w:t xml:space="preserve">First, we created a list with all the names for the features because the cvs file only contained data and not headers. We also skipped the first row because it only contained empty commas. The data was pretty clean, meaning there wasn‘t any missing values but one column came in always set to 0. So we dropped the last column because it had no benefit for us. So next we just split the data into train and test data 80/20. The data set had usability of 10.0 on keggle, and didn‘t need more processing.  </w:t>
+        <w:t xml:space="preserve">First, we created a list with all the names for the features because the cvs file only contained data and not headers. We also skipped the first row because it only contained empty commas. The data was pretty clean, meaning there wasn‘t any missing values but one column came in always set to 0. So we dropped the last column because it had no benefit for us. So next we just split the data into train and test data 80/20. The data set had usability of 10.0 on keggle, and didn‘t need more processing. </w:t>
+      </w:r>
+      <w:r>
+        <w:rPr>
+          <w:lang w:val="is-IS"/>
+        </w:rPr>
+        <w:t xml:space="preserve">There are a lof outliers, however these outliers represent a real observations from the match, so we aren‘t going to delete them. Also because they are just so many, and we would be shrinking our data hugedly. Instead, when needed we will just use scalers. </w:t>
+      </w:r>
+      <w:r>
+        <w:rPr>
+          <w:lang w:val="is-IS"/>
+        </w:rPr>
+        <w:t xml:space="preserve"> </w:t>
       </w:r>
     </w:p>
     <w:p>
@@ -248,6 +272,7 @@
         <w:rPr>
           <w:lang w:val="is-IS"/>
         </w:rPr>
+        <w:lastRenderedPageBreak/>
         <w:t xml:space="preserve">We also added to the pipe different values of k nearest neighbours and different weights (hyper-parameters). Then we created a gridsearch which had 5 crossvalidations. After trying different values of k nearest neigbours, we observed that the test always selects the highest value. </w:t>
       </w:r>
       <w:r>
@@ -260,169 +285,594 @@
         <w:rPr>
           <w:lang w:val="is-IS"/>
         </w:rPr>
-        <w:t xml:space="preserve">We also checked with code if some features could be dropped to make the dimmensionality smaller. So we checked if some features </w:t>
-      </w:r>
+        <w:t xml:space="preserve">We also checked with code if some features could be dropped to make the dimmensionality smaller. So we checked if some features depend on each other, and found that kills and gold depend on each other. So we tried dropping either one and testing with the same best set up, however that didn‘t improve accuracy. </w:t>
+      </w:r>
+    </w:p>
+    <w:p>
+      <w:pPr>
+        <w:rPr>
+          <w:lang w:val="is-IS"/>
+        </w:rPr>
+      </w:pPr>
+    </w:p>
+    <w:p>
+      <w:pPr>
+        <w:rPr>
+          <w:lang w:val="is-IS"/>
+        </w:rPr>
+      </w:pPr>
+      <w:r>
+        <w:rPr>
+          <w:lang w:val="is-IS"/>
+        </w:rPr>
+        <w:t>Now me knowing something about this game, I assumed that more kills and gold for specific team probably would result in a win for the team. So next we tried logistic regression, because when reading about it on the sklearn page, it was mentioned that it works well if features follow linear relationship. So we first tried it witho</w:t>
+      </w:r>
+      <w:r>
+        <w:rPr>
+          <w:lang w:val="is-IS"/>
+        </w:rPr>
+        <w:t>u</w:t>
+      </w:r>
+      <w:r>
+        <w:rPr>
+          <w:lang w:val="is-IS"/>
+        </w:rPr>
+        <w:t xml:space="preserve">t scaling, </w:t>
+      </w:r>
+      <w:r>
+        <w:rPr>
+          <w:lang w:val="is-IS"/>
+        </w:rPr>
+        <w:t xml:space="preserve">and got very good accuracy. </w:t>
+      </w:r>
+      <w:r>
+        <w:rPr>
+          <w:lang w:val="is-IS"/>
+        </w:rPr>
+        <w:t xml:space="preserve">Next we tried scaling and also tried to find features which werent contributing a lot to the result. We found that these werent being used a lot: </w:t>
+      </w:r>
+      <w:r>
+        <w:rPr>
+          <w:lang w:val="is-IS"/>
+        </w:rPr>
+        <w:t>"redTeamJungleMinions",</w:t>
+      </w:r>
+    </w:p>
+    <w:p>
+      <w:pPr>
+        <w:rPr>
+          <w:lang w:val="is-IS"/>
+        </w:rPr>
+      </w:pPr>
+      <w:r>
+        <w:rPr>
+          <w:lang w:val="is-IS"/>
+        </w:rPr>
+        <w:t xml:space="preserve">    "blueTeamJungleMinions",</w:t>
+      </w:r>
+    </w:p>
+    <w:p>
+      <w:pPr>
+        <w:rPr>
+          <w:lang w:val="is-IS"/>
+        </w:rPr>
+      </w:pPr>
+      <w:r>
+        <w:rPr>
+          <w:lang w:val="is-IS"/>
+        </w:rPr>
+        <w:t xml:space="preserve">    "blueTeamHeraldKills",</w:t>
+      </w:r>
+    </w:p>
+    <w:p>
+      <w:pPr>
+        <w:rPr>
+          <w:lang w:val="is-IS"/>
+        </w:rPr>
+      </w:pPr>
+      <w:r>
+        <w:rPr>
+          <w:lang w:val="is-IS"/>
+        </w:rPr>
+        <w:t xml:space="preserve">    "blueTeamTurretPlatesDestroyed",</w:t>
+      </w:r>
+    </w:p>
+    <w:p>
+      <w:pPr>
+        <w:rPr>
+          <w:lang w:val="is-IS"/>
+        </w:rPr>
+      </w:pPr>
+      <w:r>
+        <w:rPr>
+          <w:lang w:val="is-IS"/>
+        </w:rPr>
+        <w:t xml:space="preserve">    "redTeamMinionsKilled"</w:t>
+      </w:r>
+    </w:p>
+    <w:p>
+      <w:pPr>
+        <w:rPr>
+          <w:lang w:val="is-IS"/>
+        </w:rPr>
+      </w:pPr>
+    </w:p>
+    <w:p>
+      <w:pPr>
+        <w:rPr>
+          <w:lang w:val="is-IS"/>
+        </w:rPr>
+      </w:pPr>
+      <w:r>
+        <w:rPr>
+          <w:lang w:val="is-IS"/>
+        </w:rPr>
+        <w:t xml:space="preserve">So we tried deleting them and got pretty much the same accuracy, the test accuracy was a little bit higher but that could be because of randomness. So logistic regression didn‘t show any major benefit, so we tried next decission tree which can </w:t>
+      </w:r>
+      <w:r>
+        <w:rPr>
+          <w:lang w:val="is-IS"/>
+        </w:rPr>
+        <w:t>capture nonlinear relationships</w:t>
+      </w:r>
+      <w:r>
+        <w:rPr>
+          <w:lang w:val="is-IS"/>
+        </w:rPr>
+        <w:t xml:space="preserve">, which logistic isn‘t that good at. We tried decission tree because its kinda checking the opposite. We tried many hyperparameters but decission didn‘t also show us any signifant progress in accuracy. </w:t>
+      </w:r>
+      <w:r>
+        <w:rPr>
+          <w:lang w:val="is-IS"/>
+        </w:rPr>
+        <w:t>We tried these hyperparameters:</w:t>
+      </w:r>
+    </w:p>
+    <w:p>
+      <w:pPr>
+        <w:rPr>
+          <w:lang w:val="is-IS"/>
+        </w:rPr>
+      </w:pPr>
+    </w:p>
+    <w:p>
+      <w:pPr>
+        <w:rPr>
+          <w:lang w:val="is-IS"/>
+        </w:rPr>
+      </w:pPr>
+      <w:r>
+        <w:rPr>
+          <w:lang w:val="is-IS"/>
+        </w:rPr>
+        <w:t xml:space="preserve"> </w:t>
+      </w:r>
+      <w:r>
+        <w:rPr>
+          <w:lang w:val="is-IS"/>
+        </w:rPr>
+        <w:t>dt__criterion": ["gini", "entropy"],</w:t>
+      </w:r>
+    </w:p>
+    <w:p>
+      <w:pPr>
+        <w:rPr>
+          <w:lang w:val="is-IS"/>
+        </w:rPr>
+      </w:pPr>
+      <w:r>
+        <w:rPr>
+          <w:lang w:val="is-IS"/>
+        </w:rPr>
+        <w:t xml:space="preserve">    "dt__max_depth": [None, 3, 5, 10, 15, 20],</w:t>
+      </w:r>
+    </w:p>
+    <w:p>
+      <w:pPr>
+        <w:rPr>
+          <w:lang w:val="is-IS"/>
+        </w:rPr>
+      </w:pPr>
+      <w:r>
+        <w:rPr>
+          <w:lang w:val="is-IS"/>
+        </w:rPr>
+        <w:t xml:space="preserve">    "dt__min_samples_split": [2, 5, 10, 20],</w:t>
+      </w:r>
+    </w:p>
+    <w:p>
+      <w:pPr>
+        <w:rPr>
+          <w:lang w:val="is-IS"/>
+        </w:rPr>
+      </w:pPr>
+      <w:r>
+        <w:rPr>
+          <w:lang w:val="is-IS"/>
+        </w:rPr>
+        <w:t xml:space="preserve">    "dt__min_samples_leaf": [1, 2, 5, 10],</w:t>
+      </w:r>
+    </w:p>
+    <w:p>
+      <w:pPr>
+        <w:rPr>
+          <w:lang w:val="is-IS"/>
+        </w:rPr>
+      </w:pPr>
+      <w:r>
+        <w:rPr>
+          <w:lang w:val="is-IS"/>
+        </w:rPr>
+        <w:t xml:space="preserve">    "dt__max_features": [None, "sqrt", "log2"],</w:t>
+      </w:r>
+    </w:p>
+    <w:p>
+      <w:pPr>
+        <w:rPr>
+          <w:lang w:val="is-IS"/>
+        </w:rPr>
+      </w:pPr>
+      <w:r>
+        <w:rPr>
+          <w:lang w:val="is-IS"/>
+        </w:rPr>
+        <w:t xml:space="preserve">    "dt__ccp_alpha": [0, 0.001, 0.01</w:t>
+      </w:r>
+      <w:r>
+        <w:rPr>
+          <w:lang w:val="is-IS"/>
+        </w:rPr>
+        <w:t>, 0.1</w:t>
+      </w:r>
+      <w:r>
+        <w:rPr>
+          <w:lang w:val="is-IS"/>
+        </w:rPr>
+        <w:t>]</w:t>
+      </w:r>
+    </w:p>
+    <w:p>
+      <w:pPr>
+        <w:rPr>
+          <w:lang w:val="is-IS"/>
+        </w:rPr>
+      </w:pPr>
+    </w:p>
+    <w:p>
+      <w:pPr>
+        <w:rPr>
+          <w:lang w:val="is-IS"/>
+        </w:rPr>
+      </w:pPr>
+      <w:r>
+        <w:rPr>
+          <w:lang w:val="is-IS"/>
+        </w:rPr>
+        <w:t xml:space="preserve">In this test our goal was to simply try as many different hyperparameters as possible. Gini and entropy is a interesting hyperparameter because its just a different way of deciding on how handing splits. Another interesting one is max_feature, which is just the amount of features the tree can use for each split. We also used ccp_alpha, which is just a prunning in a decisison tree. The other features are pretty self explenatory. The values we decided to use were just random. </w:t>
+      </w:r>
+      <w:r>
+        <w:rPr>
+          <w:lang w:val="is-IS"/>
+        </w:rPr>
+        <w:t xml:space="preserve"> We didn‘t really see a better accuracy with this so next we tried Adaboost, which also uses decisison trees, but many weak ones.</w:t>
+      </w:r>
+      <w:r>
+        <w:rPr>
+          <w:lang w:val="is-IS"/>
+        </w:rPr>
+        <w:t xml:space="preserve"> We decided to test there hyperparameters: </w:t>
+      </w:r>
+    </w:p>
+    <w:p>
+      <w:pPr>
+        <w:rPr>
+          <w:lang w:val="is-IS"/>
+        </w:rPr>
+      </w:pPr>
+    </w:p>
+    <w:p>
+      <w:pPr>
+        <w:rPr>
+          <w:lang w:val="is-IS"/>
+        </w:rPr>
+      </w:pPr>
+      <w:r>
+        <w:rPr>
+          <w:lang w:val="is-IS"/>
+        </w:rPr>
+        <w:t>params = {</w:t>
+      </w:r>
+    </w:p>
+    <w:p>
+      <w:pPr>
+        <w:rPr>
+          <w:lang w:val="is-IS"/>
+        </w:rPr>
+      </w:pPr>
+      <w:r>
+        <w:rPr>
+          <w:lang w:val="is-IS"/>
+        </w:rPr>
+        <w:t xml:space="preserve">    "ada__n_estimators": [25, 50, 100, 200, 500],</w:t>
+      </w:r>
+    </w:p>
+    <w:p>
+      <w:pPr>
+        <w:rPr>
+          <w:lang w:val="is-IS"/>
+        </w:rPr>
+      </w:pPr>
       <w:r>
         <w:rPr>
           <w:lang w:val="is-IS"/>
         </w:rPr>
         <w:lastRenderedPageBreak/>
-        <w:t xml:space="preserve">depend on each other, and found that kills and gold depend on each other. So we tried dropping either one and testing with the same best set up, however that didn‘t improve accuracy. </w:t>
-      </w:r>
-    </w:p>
-    <w:p>
-      <w:pPr>
-        <w:rPr>
-          <w:lang w:val="is-IS"/>
-        </w:rPr>
-      </w:pPr>
-    </w:p>
-    <w:p>
-      <w:pPr>
-        <w:rPr>
-          <w:lang w:val="is-IS"/>
-        </w:rPr>
-      </w:pPr>
-      <w:r>
-        <w:rPr>
-          <w:lang w:val="is-IS"/>
-        </w:rPr>
-        <w:t>Now me knowing something about this game, I assumed that more kills and gold for specific team probably would result in a win for the team. So next we tried logistic regression, because when reading about it on the sklearn page, it was mentioned that it works well if features follow linear relationship. So we first tried it witho</w:t>
-      </w:r>
-      <w:r>
-        <w:rPr>
-          <w:lang w:val="is-IS"/>
-        </w:rPr>
-        <w:t>u</w:t>
-      </w:r>
-      <w:r>
-        <w:rPr>
-          <w:lang w:val="is-IS"/>
-        </w:rPr>
-        <w:t xml:space="preserve">t scaling, </w:t>
-      </w:r>
-      <w:r>
-        <w:rPr>
-          <w:lang w:val="is-IS"/>
-        </w:rPr>
-        <w:t xml:space="preserve">and got very good accuracy. </w:t>
-      </w:r>
-      <w:r>
-        <w:rPr>
-          <w:lang w:val="is-IS"/>
-        </w:rPr>
-        <w:t xml:space="preserve">Next we tried scaling and also tried to find features which werent contributing a lot to the result. We found that these werent being used a lot: </w:t>
-      </w:r>
-      <w:r>
-        <w:rPr>
-          <w:lang w:val="is-IS"/>
-        </w:rPr>
-        <w:t>"redTeamJungleMinions",</w:t>
-      </w:r>
-    </w:p>
-    <w:p>
-      <w:pPr>
-        <w:rPr>
-          <w:lang w:val="is-IS"/>
-        </w:rPr>
-      </w:pPr>
-      <w:r>
-        <w:rPr>
-          <w:lang w:val="is-IS"/>
-        </w:rPr>
-        <w:t xml:space="preserve">    "blueTeamJungleMinions",</w:t>
-      </w:r>
-    </w:p>
-    <w:p>
-      <w:pPr>
-        <w:rPr>
-          <w:lang w:val="is-IS"/>
-        </w:rPr>
-      </w:pPr>
-      <w:r>
-        <w:rPr>
-          <w:lang w:val="is-IS"/>
-        </w:rPr>
-        <w:t xml:space="preserve">    "blueTeamHeraldKills",</w:t>
-      </w:r>
-    </w:p>
-    <w:p>
-      <w:pPr>
-        <w:rPr>
-          <w:lang w:val="is-IS"/>
-        </w:rPr>
-      </w:pPr>
-      <w:r>
-        <w:rPr>
-          <w:lang w:val="is-IS"/>
-        </w:rPr>
-        <w:t xml:space="preserve">    "blueTeamTurretPlatesDestroyed",</w:t>
-      </w:r>
-    </w:p>
-    <w:p>
-      <w:pPr>
-        <w:rPr>
-          <w:lang w:val="is-IS"/>
-        </w:rPr>
-      </w:pPr>
-      <w:r>
-        <w:rPr>
-          <w:lang w:val="is-IS"/>
-        </w:rPr>
-        <w:t xml:space="preserve">    "redTeamMinionsKilled"</w:t>
-      </w:r>
-    </w:p>
-    <w:p>
-      <w:pPr>
-        <w:rPr>
-          <w:lang w:val="is-IS"/>
-        </w:rPr>
-      </w:pPr>
-    </w:p>
-    <w:p>
-      <w:pPr>
-        <w:rPr>
-          <w:lang w:val="is-IS"/>
-        </w:rPr>
-      </w:pPr>
-      <w:r>
-        <w:rPr>
-          <w:lang w:val="is-IS"/>
-        </w:rPr>
-        <w:t xml:space="preserve">So we tried deleting them and got pretty much the same accuracy, the test accuracy was a little bit higher but that could be because of randomness. So logistic regression didn‘t show any major benefit, so we tried next decission tree which can </w:t>
-      </w:r>
-      <w:r>
-        <w:rPr>
-          <w:lang w:val="is-IS"/>
-        </w:rPr>
-        <w:t>capture nonlinear relationships</w:t>
-      </w:r>
-      <w:r>
-        <w:rPr>
-          <w:lang w:val="is-IS"/>
-        </w:rPr>
-        <w:t xml:space="preserve">, which logistic isn‘t that good at. We tried decission tree because its kinda checking the opposite. We tried many hyperparameters but decission didn‘t also show us any signifant progress in accuracy. </w:t>
-      </w:r>
-      <w:r>
-        <w:rPr>
-          <w:lang w:val="is-IS"/>
-        </w:rPr>
-        <w:t>We tried these hyperparameters:</w:t>
-      </w:r>
-    </w:p>
-    <w:p>
-      <w:pPr>
-        <w:rPr>
-          <w:lang w:val="is-IS"/>
-        </w:rPr>
-      </w:pPr>
-    </w:p>
-    <w:p>
-      <w:pPr>
-        <w:rPr>
-          <w:lang w:val="is-IS"/>
-        </w:rPr>
-      </w:pPr>
+        <w:t xml:space="preserve">    "ada__learning_rate": [0.01, 0.02, 0.4, 0.8, 1.0],</w:t>
+      </w:r>
+    </w:p>
+    <w:p>
+      <w:pPr>
+        <w:rPr>
+          <w:lang w:val="is-IS"/>
+        </w:rPr>
+      </w:pPr>
+      <w:r>
+        <w:rPr>
+          <w:lang w:val="is-IS"/>
+        </w:rPr>
+        <w:t xml:space="preserve">    "ada__estimator__max_depth": [1, 2, 3, 4],</w:t>
+      </w:r>
+    </w:p>
+    <w:p>
+      <w:pPr>
+        <w:rPr>
+          <w:lang w:val="is-IS"/>
+        </w:rPr>
+      </w:pPr>
+      <w:r>
+        <w:rPr>
+          <w:lang w:val="is-IS"/>
+        </w:rPr>
+        <w:t>"ada__estimator__min_samples_leaf": [1, 5, 10,15]</w:t>
+      </w:r>
+    </w:p>
+    <w:p>
+      <w:pPr>
+        <w:rPr>
+          <w:lang w:val="is-IS"/>
+        </w:rPr>
+      </w:pPr>
+      <w:r>
+        <w:rPr>
+          <w:lang w:val="is-IS"/>
+        </w:rPr>
+        <w:t>}</w:t>
+      </w:r>
+    </w:p>
+    <w:p>
+      <w:pPr>
+        <w:rPr>
+          <w:lang w:val="is-IS"/>
+        </w:rPr>
+      </w:pPr>
+    </w:p>
+    <w:p>
+      <w:pPr>
+        <w:rPr>
+          <w:lang w:val="is-IS"/>
+        </w:rPr>
+      </w:pPr>
+      <w:r>
+        <w:rPr>
+          <w:lang w:val="is-IS"/>
+        </w:rPr>
+        <w:t>Because we think these are most important. We also had „</w:t>
+      </w:r>
+      <w:r>
+        <w:rPr>
+          <w:lang w:val="is-IS"/>
+        </w:rPr>
+        <w:t>class_weight</w:t>
+      </w:r>
+      <w:r>
+        <w:rPr>
+          <w:lang w:val="is-IS"/>
+        </w:rPr>
+        <w:t xml:space="preserve">“, but we decided to delete because our data is pretty balanced so this wouldn‘t be making a huge difference. We used N_estimators, because we need to test with how many trees the model performs best. Then we need to test the learning rate, to see how much influnce each tree should have on the next. The values are just some ranges we randomly picked. </w:t>
+      </w:r>
+      <w:r>
+        <w:rPr>
+          <w:lang w:val="is-IS"/>
+        </w:rPr>
+        <w:t xml:space="preserve">The others are just basic max depth limit and minimum amount of samples that need to be in leafs. </w:t>
+      </w:r>
+    </w:p>
+    <w:p>
+      <w:pPr>
+        <w:rPr>
+          <w:lang w:val="is-IS"/>
+        </w:rPr>
+      </w:pPr>
+    </w:p>
+    <w:p>
+      <w:pPr>
+        <w:rPr>
+          <w:lang w:val="is-IS"/>
+        </w:rPr>
+      </w:pPr>
+      <w:r>
+        <w:rPr>
+          <w:lang w:val="is-IS"/>
+        </w:rPr>
+        <w:t>Then we decided to try XGBoost. So far none of our models seemed to be making the accuracy improve so we didn‘t find one model which we could dive deep into. After talking with the TA, at the problem session he recommended to try XGBoost. We also didn‘t try any gradient boos</w:t>
+      </w:r>
+      <w:r>
+        <w:rPr>
+          <w:lang w:val="is-IS"/>
+        </w:rPr>
+        <w:t>t</w:t>
+      </w:r>
+      <w:r>
+        <w:rPr>
+          <w:lang w:val="is-IS"/>
+        </w:rPr>
+        <w:t xml:space="preserve">ing in any of our models so we though we would give this </w:t>
+      </w:r>
+      <w:r>
+        <w:rPr>
+          <w:lang w:val="is-IS"/>
+        </w:rPr>
+        <w:t>one a</w:t>
+      </w:r>
+      <w:r>
+        <w:rPr>
+          <w:lang w:val="is-IS"/>
+        </w:rPr>
+        <w:t xml:space="preserve"> try. </w:t>
+      </w:r>
+      <w:r>
+        <w:rPr>
+          <w:lang w:val="is-IS"/>
+        </w:rPr>
+        <w:t>Among others, we</w:t>
+      </w:r>
+      <w:r>
+        <w:rPr>
+          <w:lang w:val="is-IS"/>
+        </w:rPr>
+        <w:t xml:space="preserve"> used </w:t>
+      </w:r>
+      <w:r>
+        <w:rPr>
+          <w:lang w:val="is-IS"/>
+        </w:rPr>
+        <w:t xml:space="preserve">„subsample“ for the hyperparameter because it takes certain percentage of data and trains on that. In our case, we have some outliers so this could be a good thing to test. The rest of parameters behave the same as in ada. So we have: </w:t>
+      </w:r>
+    </w:p>
+    <w:p>
+      <w:pPr>
+        <w:rPr>
+          <w:lang w:val="is-IS"/>
+        </w:rPr>
+      </w:pPr>
+    </w:p>
+    <w:p>
+      <w:pPr>
+        <w:rPr>
+          <w:lang w:val="is-IS"/>
+        </w:rPr>
+      </w:pPr>
+      <w:r>
+        <w:rPr>
+          <w:lang w:val="is-IS"/>
+        </w:rPr>
+        <w:t>params = {</w:t>
+      </w:r>
+    </w:p>
+    <w:p>
+      <w:pPr>
+        <w:rPr>
+          <w:lang w:val="is-IS"/>
+        </w:rPr>
+      </w:pPr>
+      <w:r>
+        <w:rPr>
+          <w:lang w:val="is-IS"/>
+        </w:rPr>
+        <w:t xml:space="preserve">    "xgb__n_estimators": [100, 200, 300, 500],</w:t>
+      </w:r>
+    </w:p>
+    <w:p>
+      <w:pPr>
+        <w:rPr>
+          <w:lang w:val="is-IS"/>
+        </w:rPr>
+      </w:pPr>
+      <w:r>
+        <w:rPr>
+          <w:lang w:val="is-IS"/>
+        </w:rPr>
+        <w:t xml:space="preserve">    "xgb__learning_rate": [0.01, 0.05, 0.1, 0.3],</w:t>
+      </w:r>
+    </w:p>
+    <w:p>
+      <w:pPr>
+        <w:rPr>
+          <w:lang w:val="is-IS"/>
+        </w:rPr>
+      </w:pPr>
+      <w:r>
+        <w:rPr>
+          <w:lang w:val="is-IS"/>
+        </w:rPr>
+        <w:t xml:space="preserve">    "xgb__max_depth": [2, 3, 4, 6, 8],</w:t>
+      </w:r>
+    </w:p>
+    <w:p>
+      <w:pPr>
+        <w:rPr>
+          <w:lang w:val="is-IS"/>
+        </w:rPr>
+      </w:pPr>
+      <w:r>
+        <w:rPr>
+          <w:lang w:val="is-IS"/>
+        </w:rPr>
+        <w:t xml:space="preserve">    "xgb__subsample": [0.6, 0.8, 1.0]</w:t>
+      </w:r>
+    </w:p>
+    <w:p>
+      <w:pPr>
+        <w:rPr>
+          <w:lang w:val="is-IS"/>
+        </w:rPr>
+      </w:pPr>
+      <w:r>
+        <w:rPr>
+          <w:lang w:val="is-IS"/>
+        </w:rPr>
+        <w:t>}</w:t>
+      </w:r>
+    </w:p>
+    <w:p>
+      <w:pPr>
+        <w:rPr>
+          <w:lang w:val="is-IS"/>
+        </w:rPr>
+      </w:pPr>
+    </w:p>
+    <w:p>
+      <w:pPr>
+        <w:rPr>
+          <w:lang w:val="is-IS"/>
+        </w:rPr>
+      </w:pPr>
+      <w:r>
+        <w:rPr>
+          <w:lang w:val="is-IS"/>
+        </w:rPr>
+        <w:t xml:space="preserve">Now we also have higher amount of n‘s, because we are going to test lower learning rates. Meaning if we have lower learning rate we need more trees to try this one. However, all of this didn‘t really change accuracy that much. </w:t>
+      </w:r>
+    </w:p>
+    <w:p>
+      <w:pPr>
+        <w:rPr>
+          <w:lang w:val="is-IS"/>
+        </w:rPr>
+      </w:pPr>
+    </w:p>
+    <w:p>
+      <w:pPr>
+        <w:rPr>
+          <w:lang w:val="is-IS"/>
+        </w:rPr>
+      </w:pPr>
+      <w:r>
+        <w:rPr>
+          <w:lang w:val="is-IS"/>
+        </w:rPr>
+        <w:t>Next</w:t>
+      </w:r>
       <w:r>
         <w:rPr>
           <w:lang w:val="is-IS"/>
@@ -433,105 +883,73 @@
         <w:rPr>
           <w:lang w:val="is-IS"/>
         </w:rPr>
-        <w:t>dt__criterion": ["gini", "entropy"],</w:t>
-      </w:r>
-    </w:p>
-    <w:p>
-      <w:pPr>
-        <w:rPr>
-          <w:lang w:val="is-IS"/>
-        </w:rPr>
-      </w:pPr>
-      <w:r>
-        <w:rPr>
-          <w:lang w:val="is-IS"/>
-        </w:rPr>
-        <w:t xml:space="preserve">    "dt__max_depth": [None, 3, 5, 10, 15, 20],</w:t>
-      </w:r>
-    </w:p>
-    <w:p>
-      <w:pPr>
-        <w:rPr>
-          <w:lang w:val="is-IS"/>
-        </w:rPr>
-      </w:pPr>
-      <w:r>
-        <w:rPr>
-          <w:lang w:val="is-IS"/>
-        </w:rPr>
-        <w:t xml:space="preserve">    "dt__min_samples_split": [2, 5, 10, 20],</w:t>
-      </w:r>
-    </w:p>
-    <w:p>
-      <w:pPr>
-        <w:rPr>
-          <w:lang w:val="is-IS"/>
-        </w:rPr>
-      </w:pPr>
-      <w:r>
-        <w:rPr>
-          <w:lang w:val="is-IS"/>
-        </w:rPr>
-        <w:t xml:space="preserve">    "dt__min_samples_leaf": [1, 2, 5, 10],</w:t>
-      </w:r>
-    </w:p>
-    <w:p>
-      <w:pPr>
-        <w:rPr>
-          <w:lang w:val="is-IS"/>
-        </w:rPr>
-      </w:pPr>
-      <w:r>
-        <w:rPr>
-          <w:lang w:val="is-IS"/>
-        </w:rPr>
-        <w:t xml:space="preserve">    "dt__max_features": [None, "sqrt", "log2"],</w:t>
-      </w:r>
-    </w:p>
-    <w:p>
-      <w:pPr>
-        <w:rPr>
-          <w:lang w:val="is-IS"/>
-        </w:rPr>
-      </w:pPr>
-      <w:r>
-        <w:rPr>
-          <w:lang w:val="is-IS"/>
-        </w:rPr>
-        <w:t xml:space="preserve">    "dt__ccp_alpha": [0, 0.001, 0.01</w:t>
-      </w:r>
-      <w:r>
-        <w:rPr>
-          <w:lang w:val="is-IS"/>
-        </w:rPr>
-        <w:t>, 0.1</w:t>
-      </w:r>
-      <w:r>
-        <w:rPr>
-          <w:lang w:val="is-IS"/>
-        </w:rPr>
-        <w:t>]</w:t>
-      </w:r>
-    </w:p>
-    <w:p>
-      <w:pPr>
-        <w:rPr>
-          <w:lang w:val="is-IS"/>
-        </w:rPr>
-      </w:pPr>
-    </w:p>
-    <w:p>
-      <w:pPr>
-        <w:rPr>
-          <w:lang w:val="is-IS"/>
-        </w:rPr>
-      </w:pPr>
-      <w:r>
-        <w:rPr>
-          <w:lang w:val="is-IS"/>
-        </w:rPr>
-        <w:t xml:space="preserve">In this test our goal was to simply try as many different hyperparameters as possible. Gini and entropy is a interesting hyperparameter because its just a different way of deciding on how handing splits. Another interesting one is max_feature, which is just the amount of features the tree can use for each split. We also used ccp_alpha, which is just a prunning in a decisison tree. The other features are pretty self explenatory. The values we decided to use were just random. </w:t>
-      </w:r>
+        <w:t xml:space="preserve">we tried </w:t>
+      </w:r>
+      <w:r>
+        <w:rPr>
+          <w:lang w:val="is-IS"/>
+        </w:rPr>
+        <w:t xml:space="preserve">LinearSVC, </w:t>
+      </w:r>
+      <w:r>
+        <w:rPr>
+          <w:lang w:val="is-IS"/>
+        </w:rPr>
+        <w:t xml:space="preserve"> </w:t>
+      </w:r>
+      <w:r>
+        <w:rPr>
+          <w:lang w:val="is-IS"/>
+        </w:rPr>
+        <w:t xml:space="preserve">because so far our highest accuracy was with Logistic Regression so we decided to use something which is similar and not with trees because they don‘t give us good results. We only used one hyperparameter which is for regularization: </w:t>
+      </w:r>
+    </w:p>
+    <w:p>
+      <w:pPr>
+        <w:rPr>
+          <w:lang w:val="is-IS"/>
+        </w:rPr>
+      </w:pPr>
+    </w:p>
+    <w:p>
+      <w:pPr>
+        <w:rPr>
+          <w:lang w:val="is-IS"/>
+        </w:rPr>
+      </w:pPr>
+      <w:r>
+        <w:rPr>
+          <w:lang w:val="is-IS"/>
+        </w:rPr>
+        <w:t>"svm__C": [0.01, 0.1, 1, 10, 20]</w:t>
+      </w:r>
+    </w:p>
+    <w:p>
+      <w:pPr>
+        <w:rPr>
+          <w:lang w:val="is-IS"/>
+        </w:rPr>
+      </w:pPr>
+    </w:p>
+    <w:p>
+      <w:pPr>
+        <w:rPr>
+          <w:lang w:val="is-IS"/>
+        </w:rPr>
+      </w:pPr>
+      <w:r>
+        <w:rPr>
+          <w:lang w:val="is-IS"/>
+        </w:rPr>
+        <w:t xml:space="preserve">We didn‘t think we needed more. </w:t>
+      </w:r>
+    </w:p>
+    <w:p>
+      <w:pPr>
+        <w:rPr>
+          <w:lang w:val="is-IS"/>
+        </w:rPr>
+      </w:pPr>
     </w:p>
     <w:sectPr>
       <w:pgSz w:w="11906" w:h="16838"/>

</xml_diff>